<commit_message>
Fixes for homework 2 added.
</commit_message>
<xml_diff>
--- a/homework_2/Отчёт.docx
+++ b/homework_2/Отчёт.docx
@@ -2047,7 +2047,25 @@
           <w:szCs w:val="28"/>
           <w:lang w:val="en-US"/>
         </w:rPr>
-        <w:t>: TIME, NOT NULL</w:t>
+        <w:t xml:space="preserve">: </w:t>
+      </w:r>
+      <w:r>
+        <w:rPr>
+          <w:rFonts w:ascii="Times New Roman" w:hAnsi="Times New Roman" w:cs="Times New Roman"/>
+          <w:sz w:val="28"/>
+          <w:szCs w:val="28"/>
+          <w:lang w:val="en-US"/>
+        </w:rPr>
+        <w:t>TIMESTAMP</w:t>
+      </w:r>
+      <w:r>
+        <w:rPr>
+          <w:rFonts w:ascii="Times New Roman" w:hAnsi="Times New Roman" w:cs="Times New Roman"/>
+          <w:sz w:val="28"/>
+          <w:szCs w:val="28"/>
+          <w:lang w:val="en-US"/>
+        </w:rPr>
+        <w:t>, NOT NULL</w:t>
       </w:r>
       <w:r>
         <w:rPr>
@@ -2076,7 +2094,25 @@
           <w:szCs w:val="28"/>
           <w:lang w:val="en-US"/>
         </w:rPr>
-        <w:t>: TIME, NOT NULL</w:t>
+        <w:t xml:space="preserve">: </w:t>
+      </w:r>
+      <w:r>
+        <w:rPr>
+          <w:rFonts w:ascii="Times New Roman" w:hAnsi="Times New Roman" w:cs="Times New Roman"/>
+          <w:sz w:val="28"/>
+          <w:szCs w:val="28"/>
+          <w:lang w:val="en-US"/>
+        </w:rPr>
+        <w:t>TIMESTAMP</w:t>
+      </w:r>
+      <w:r>
+        <w:rPr>
+          <w:rFonts w:ascii="Times New Roman" w:hAnsi="Times New Roman" w:cs="Times New Roman"/>
+          <w:sz w:val="28"/>
+          <w:szCs w:val="28"/>
+          <w:lang w:val="en-US"/>
+        </w:rPr>
+        <w:t>, NOT NULL</w:t>
       </w:r>
       <w:r>
         <w:rPr>
@@ -2760,40 +2796,131 @@
           <w:rFonts w:ascii="Times New Roman" w:eastAsia="Times New Roman" w:hAnsi="Times New Roman" w:cs="Times New Roman"/>
           <w:sz w:val="28"/>
           <w:szCs w:val="28"/>
-          <w:lang w:eastAsia="ru-RU"/>
-        </w:rPr>
-      </w:pPr>
-      <w:r>
-        <w:rPr>
-          <w:rFonts w:ascii="Times New Roman" w:hAnsi="Times New Roman" w:cs="Times New Roman"/>
-          <w:sz w:val="28"/>
-          <w:szCs w:val="28"/>
-        </w:rPr>
-        <w:t>ScooterID: INTEGER, PK, FK (REFERENCES Scooters), NOT NULL</w:t>
-      </w:r>
-      <w:r>
-        <w:rPr>
-          <w:rFonts w:ascii="Times New Roman" w:hAnsi="Times New Roman" w:cs="Times New Roman"/>
-          <w:sz w:val="28"/>
-          <w:szCs w:val="28"/>
+          <w:lang w:val="en-US" w:eastAsia="ru-RU"/>
+        </w:rPr>
+      </w:pPr>
+      <w:proofErr w:type="spellStart"/>
+      <w:r>
+        <w:rPr>
+          <w:rFonts w:ascii="Times New Roman" w:hAnsi="Times New Roman" w:cs="Times New Roman"/>
+          <w:sz w:val="28"/>
+          <w:szCs w:val="28"/>
+          <w:lang w:val="en-US"/>
+        </w:rPr>
+        <w:t>ScooterID</w:t>
+      </w:r>
+      <w:proofErr w:type="spellEnd"/>
+      <w:r>
+        <w:rPr>
+          <w:rFonts w:ascii="Times New Roman" w:hAnsi="Times New Roman" w:cs="Times New Roman"/>
+          <w:sz w:val="28"/>
+          <w:szCs w:val="28"/>
+          <w:lang w:val="en-US"/>
+        </w:rPr>
+        <w:t>: INTEGER, PK, FK (REFERENCES Scooters), NOT NULL</w:t>
+      </w:r>
+      <w:r>
+        <w:rPr>
+          <w:rFonts w:ascii="Times New Roman" w:hAnsi="Times New Roman" w:cs="Times New Roman"/>
+          <w:sz w:val="28"/>
+          <w:szCs w:val="28"/>
+          <w:lang w:val="en-US"/>
         </w:rPr>
         <w:br/>
-        <w:t>ParkingZoneID: INTEGER, PK, FK (REFERENCES Parking_Zones), NOT NULL</w:t>
-      </w:r>
-      <w:r>
-        <w:rPr>
-          <w:rFonts w:ascii="Times New Roman" w:hAnsi="Times New Roman" w:cs="Times New Roman"/>
-          <w:sz w:val="28"/>
-          <w:szCs w:val="28"/>
+      </w:r>
+      <w:proofErr w:type="spellStart"/>
+      <w:r>
+        <w:rPr>
+          <w:rFonts w:ascii="Times New Roman" w:hAnsi="Times New Roman" w:cs="Times New Roman"/>
+          <w:sz w:val="28"/>
+          <w:szCs w:val="28"/>
+          <w:lang w:val="en-US"/>
+        </w:rPr>
+        <w:t>ParkingZoneID</w:t>
+      </w:r>
+      <w:proofErr w:type="spellEnd"/>
+      <w:r>
+        <w:rPr>
+          <w:rFonts w:ascii="Times New Roman" w:hAnsi="Times New Roman" w:cs="Times New Roman"/>
+          <w:sz w:val="28"/>
+          <w:szCs w:val="28"/>
+          <w:lang w:val="en-US"/>
+        </w:rPr>
+        <w:t xml:space="preserve">: INTEGER, PK, FK (REFERENCES </w:t>
+      </w:r>
+      <w:proofErr w:type="spellStart"/>
+      <w:r>
+        <w:rPr>
+          <w:rFonts w:ascii="Times New Roman" w:hAnsi="Times New Roman" w:cs="Times New Roman"/>
+          <w:sz w:val="28"/>
+          <w:szCs w:val="28"/>
+          <w:lang w:val="en-US"/>
+        </w:rPr>
+        <w:t>Parking_Zones</w:t>
+      </w:r>
+      <w:proofErr w:type="spellEnd"/>
+      <w:r>
+        <w:rPr>
+          <w:rFonts w:ascii="Times New Roman" w:hAnsi="Times New Roman" w:cs="Times New Roman"/>
+          <w:sz w:val="28"/>
+          <w:szCs w:val="28"/>
+          <w:lang w:val="en-US"/>
+        </w:rPr>
+        <w:t>), NOT NULL</w:t>
+      </w:r>
+      <w:r>
+        <w:rPr>
+          <w:rFonts w:ascii="Times New Roman" w:hAnsi="Times New Roman" w:cs="Times New Roman"/>
+          <w:sz w:val="28"/>
+          <w:szCs w:val="28"/>
+          <w:lang w:val="en-US"/>
         </w:rPr>
         <w:br/>
-        <w:t>ArrivedAt: TIME, PK, NOT NULL</w:t>
-      </w:r>
-      <w:r>
-        <w:rPr>
-          <w:rFonts w:ascii="Times New Roman" w:hAnsi="Times New Roman" w:cs="Times New Roman"/>
-          <w:sz w:val="28"/>
-          <w:szCs w:val="28"/>
+      </w:r>
+      <w:proofErr w:type="spellStart"/>
+      <w:r>
+        <w:rPr>
+          <w:rFonts w:ascii="Times New Roman" w:hAnsi="Times New Roman" w:cs="Times New Roman"/>
+          <w:sz w:val="28"/>
+          <w:szCs w:val="28"/>
+          <w:lang w:val="en-US"/>
+        </w:rPr>
+        <w:t>ArrivedAt</w:t>
+      </w:r>
+      <w:proofErr w:type="spellEnd"/>
+      <w:r>
+        <w:rPr>
+          <w:rFonts w:ascii="Times New Roman" w:hAnsi="Times New Roman" w:cs="Times New Roman"/>
+          <w:sz w:val="28"/>
+          <w:szCs w:val="28"/>
+          <w:lang w:val="en-US"/>
+        </w:rPr>
+        <w:t xml:space="preserve">: </w:t>
+      </w:r>
+      <w:r>
+        <w:rPr>
+          <w:rFonts w:ascii="Times New Roman" w:hAnsi="Times New Roman" w:cs="Times New Roman"/>
+          <w:sz w:val="28"/>
+          <w:szCs w:val="28"/>
+          <w:lang w:val="en-US"/>
+        </w:rPr>
+        <w:t>TIMESTAMP</w:t>
+      </w:r>
+      <w:r>
+        <w:rPr>
+          <w:rFonts w:ascii="Times New Roman" w:hAnsi="Times New Roman" w:cs="Times New Roman"/>
+          <w:sz w:val="28"/>
+          <w:szCs w:val="28"/>
+          <w:lang w:val="en-US"/>
+        </w:rPr>
+        <w:t>, PK, NOT NULL</w:t>
+      </w:r>
+      <w:r>
+        <w:rPr>
+          <w:rFonts w:ascii="Times New Roman" w:hAnsi="Times New Roman" w:cs="Times New Roman"/>
+          <w:sz w:val="28"/>
+          <w:szCs w:val="28"/>
+          <w:lang w:val="en-US"/>
         </w:rPr>
         <w:br/>
       </w:r>
@@ -2803,6 +2930,7 @@
           <w:rFonts w:ascii="Times New Roman" w:hAnsi="Times New Roman" w:cs="Times New Roman"/>
           <w:sz w:val="28"/>
           <w:szCs w:val="28"/>
+          <w:lang w:val="en-US"/>
         </w:rPr>
         <w:t>LeftAt</w:t>
       </w:r>
@@ -2812,8 +2940,18 @@
           <w:rFonts w:ascii="Times New Roman" w:hAnsi="Times New Roman" w:cs="Times New Roman"/>
           <w:sz w:val="28"/>
           <w:szCs w:val="28"/>
-        </w:rPr>
-        <w:t>: TIME</w:t>
+          <w:lang w:val="en-US"/>
+        </w:rPr>
+        <w:t xml:space="preserve">: </w:t>
+      </w:r>
+      <w:r>
+        <w:rPr>
+          <w:rFonts w:ascii="Times New Roman" w:hAnsi="Times New Roman" w:cs="Times New Roman"/>
+          <w:sz w:val="28"/>
+          <w:szCs w:val="28"/>
+          <w:lang w:val="en-US"/>
+        </w:rPr>
+        <w:t>TIMESTAMP</w:t>
       </w:r>
     </w:p>
     <w:p>
@@ -3326,14 +3464,7 @@
           <w:sz w:val="28"/>
           <w:szCs w:val="28"/>
         </w:rPr>
-        <w:t xml:space="preserve">Parking_Zones и </w:t>
-      </w:r>
-      <w:r>
-        <w:rPr>
-          <w:sz w:val="28"/>
-          <w:szCs w:val="28"/>
-        </w:rPr>
-        <w:t>completed_trips (Один-ко-Многим): Одна парковочная зона может быть связана со множеством завершённых поездок, но каждая поездка относится к одной конкретной парковочной зоне.</w:t>
+        <w:t>Parking_Zones и completed_trips (Один-ко-Многим): Одна парковочная зона может быть связана со множеством завершённых поездок, но каждая поездка относится к одной конкретной парковочной зоне.</w:t>
       </w:r>
       <w:r>
         <w:rPr>
@@ -3357,14 +3488,7 @@
           <w:sz w:val="28"/>
           <w:szCs w:val="28"/>
         </w:rPr>
-        <w:t xml:space="preserve"> является внешним ключом, ссылающимся на Parking_Zon</w:t>
-      </w:r>
-      <w:r>
-        <w:rPr>
-          <w:sz w:val="28"/>
-          <w:szCs w:val="28"/>
-        </w:rPr>
-        <w:t>es.ParkingZoneID.</w:t>
+        <w:t xml:space="preserve"> является внешним ключом, ссылающимся на Parking_Zones.ParkingZoneID.</w:t>
       </w:r>
     </w:p>
     <w:p>
@@ -3801,31 +3925,7 @@
           <w:sz w:val="28"/>
           <w:szCs w:val="28"/>
         </w:rPr>
-        <w:t xml:space="preserve">Нормализация до третьей </w:t>
-      </w:r>
-      <w:r>
-        <w:rPr>
-          <w:rFonts w:ascii="Times New Roman" w:hAnsi="Times New Roman" w:cs="Times New Roman"/>
-          <w:sz w:val="28"/>
-          <w:szCs w:val="28"/>
-        </w:rPr>
-        <w:t>нормальной формы (3НФ): Все таблицы имеют атомарные значения и соответствуют первой нормальной форме. Во второй нормальной форме отсутствуют частичные зависимости неключевых атрибутов от составного первичного ключа. В третьей нормальной форме неключевые ат</w:t>
-      </w:r>
-      <w:r>
-        <w:rPr>
-          <w:rFonts w:ascii="Times New Roman" w:hAnsi="Times New Roman" w:cs="Times New Roman"/>
-          <w:sz w:val="28"/>
-          <w:szCs w:val="28"/>
-        </w:rPr>
-        <w:t>рибуты не зависят транзитивно от первичного ключа: данные о пользователях, самокатах и парковочных зонах хранятся в отдельных таблицах, а связи между сущностями реализованы через внешние ключи. Это уменьшает дублирование данных и предотвращает аномалии вст</w:t>
-      </w:r>
-      <w:r>
-        <w:rPr>
-          <w:rFonts w:ascii="Times New Roman" w:hAnsi="Times New Roman" w:cs="Times New Roman"/>
-          <w:sz w:val="28"/>
-          <w:szCs w:val="28"/>
-        </w:rPr>
-        <w:t>авки, обновления и удаления.</w:t>
+        <w:t>Нормализация до третьей нормальной формы (3НФ): Все таблицы имеют атомарные значения и соответствуют первой нормальной форме. Во второй нормальной форме отсутствуют частичные зависимости неключевых атрибутов от составного первичного ключа. В третьей нормальной форме неключевые атрибуты не зависят транзитивно от первичного ключа: данные о пользователях, самокатах и парковочных зонах хранятся в отдельных таблицах, а связи между сущностями реализованы через внешние ключи. Это уменьшает дублирование данных и предотвращает аномалии вставки, обновления и удаления.</w:t>
       </w:r>
     </w:p>
     <w:p>

</xml_diff>